<commit_message>
fix: clean XML tags inside docxtemplater variables in 2026 Word templates
</commit_message>
<xml_diff>
--- a/Padlás födém szigetelés dokumentum managment/templates/2026 Kivitelezoi nyil.jk_v2.docx
+++ b/Padlás födém szigetelés dokumentum managment/templates/2026 Kivitelezoi nyil.jk_v2.docx
@@ -145,23 +145,7 @@
           <w:rFonts w:ascii="Times New Roman" w:eastAsia="Times New Roman" w:hAnsi="Times New Roman" w:cs="Times New Roman"/>
           <w:color w:val="000000"/>
         </w:rPr>
-        <w:t>[[</w:t>
-      </w:r>
-      <w:proofErr w:type="spellStart"/>
-      <w:r>
-        <w:rPr>
-          <w:rFonts w:ascii="Times New Roman" w:eastAsia="Times New Roman" w:hAnsi="Times New Roman" w:cs="Times New Roman"/>
-          <w:color w:val="000000"/>
-        </w:rPr>
-        <w:t>nev</w:t>
-      </w:r>
-      <w:proofErr w:type="spellEnd"/>
-      <w:r>
-        <w:rPr>
-          <w:rFonts w:ascii="Times New Roman" w:eastAsia="Times New Roman" w:hAnsi="Times New Roman" w:cs="Times New Roman"/>
-          <w:color w:val="000000"/>
-        </w:rPr>
-        <w:t>]]</w:t>
+        <w:t>[[nev]]</w:t>
       </w:r>
     </w:p>
     <w:p>
@@ -222,23 +206,7 @@
           <w:sz w:val="21"/>
           <w:szCs w:val="21"/>
         </w:rPr>
-        <w:t>[[</w:t>
-      </w:r>
-      <w:proofErr w:type="spellStart"/>
-      <w:r>
-        <w:rPr>
-          <w:sz w:val="21"/>
-          <w:szCs w:val="21"/>
-        </w:rPr>
-        <w:t>cim</w:t>
-      </w:r>
-      <w:proofErr w:type="spellEnd"/>
-      <w:r>
-        <w:rPr>
-          <w:sz w:val="21"/>
-          <w:szCs w:val="21"/>
-        </w:rPr>
-        <w:t>]]</w:t>
+        <w:t>[[cim]]</w:t>
       </w:r>
     </w:p>
     <w:p>
@@ -622,23 +590,7 @@
           <w:rFonts w:ascii="Times New Roman" w:eastAsia="Times New Roman" w:hAnsi="Times New Roman" w:cs="Times New Roman"/>
           <w:color w:val="000000"/>
         </w:rPr>
-        <w:t>[[</w:t>
-      </w:r>
-      <w:proofErr w:type="spellStart"/>
-      <w:r>
-        <w:rPr>
-          <w:rFonts w:ascii="Times New Roman" w:eastAsia="Times New Roman" w:hAnsi="Times New Roman" w:cs="Times New Roman"/>
-          <w:color w:val="000000"/>
-        </w:rPr>
-        <w:t>epiteseve</w:t>
-      </w:r>
-      <w:proofErr w:type="spellEnd"/>
-      <w:r>
-        <w:rPr>
-          <w:rFonts w:ascii="Times New Roman" w:eastAsia="Times New Roman" w:hAnsi="Times New Roman" w:cs="Times New Roman"/>
-          <w:color w:val="000000"/>
-        </w:rPr>
-        <w:t>]]</w:t>
+        <w:t>[[epiteseve]]</w:t>
       </w:r>
     </w:p>
     <w:p>
@@ -713,23 +665,7 @@
           <w:rFonts w:ascii="Times New Roman" w:eastAsia="Times New Roman" w:hAnsi="Times New Roman" w:cs="Times New Roman"/>
           <w:color w:val="000000"/>
         </w:rPr>
-        <w:t>[[</w:t>
-      </w:r>
-      <w:proofErr w:type="spellStart"/>
-      <w:r>
-        <w:rPr>
-          <w:rFonts w:ascii="Times New Roman" w:eastAsia="Times New Roman" w:hAnsi="Times New Roman" w:cs="Times New Roman"/>
-          <w:color w:val="000000"/>
-        </w:rPr>
-        <w:t>ingatlantipusa</w:t>
-      </w:r>
-      <w:proofErr w:type="spellEnd"/>
-      <w:r>
-        <w:rPr>
-          <w:rFonts w:ascii="Times New Roman" w:eastAsia="Times New Roman" w:hAnsi="Times New Roman" w:cs="Times New Roman"/>
-          <w:color w:val="000000"/>
-        </w:rPr>
-        <w:t>]]</w:t>
+        <w:t>[[ingatlantipusa]]</w:t>
       </w:r>
     </w:p>
     <w:p>
@@ -1015,27 +951,7 @@
                 <w:sz w:val="20"/>
                 <w:szCs w:val="20"/>
               </w:rPr>
-              <w:t>[[</w:t>
-            </w:r>
-            <w:proofErr w:type="spellStart"/>
-            <w:r>
-              <w:rPr>
-                <w:rFonts w:ascii="Times New Roman" w:eastAsia="Times New Roman" w:hAnsi="Times New Roman" w:cs="Times New Roman"/>
-                <w:color w:val="000000"/>
-                <w:sz w:val="20"/>
-                <w:szCs w:val="20"/>
-              </w:rPr>
-              <w:t>facm</w:t>
-            </w:r>
-            <w:proofErr w:type="spellEnd"/>
-            <w:r>
-              <w:rPr>
-                <w:rFonts w:ascii="Times New Roman" w:eastAsia="Times New Roman" w:hAnsi="Times New Roman" w:cs="Times New Roman"/>
-                <w:color w:val="000000"/>
-                <w:sz w:val="20"/>
-                <w:szCs w:val="20"/>
-              </w:rPr>
-              <w:t>]]</w:t>
+              <w:t>[[facm]]</w:t>
             </w:r>
             <w:r>
               <w:rPr>
@@ -1110,27 +1026,7 @@
                 <w:sz w:val="20"/>
                 <w:szCs w:val="20"/>
               </w:rPr>
-              <w:t>[[</w:t>
-            </w:r>
-            <w:proofErr w:type="spellStart"/>
-            <w:r>
-              <w:rPr>
-                <w:rFonts w:ascii="Times New Roman" w:eastAsia="Times New Roman" w:hAnsi="Times New Roman" w:cs="Times New Roman"/>
-                <w:color w:val="000000"/>
-                <w:sz w:val="20"/>
-                <w:szCs w:val="20"/>
-              </w:rPr>
-              <w:t>acel</w:t>
-            </w:r>
-            <w:proofErr w:type="spellEnd"/>
-            <w:r>
-              <w:rPr>
-                <w:rFonts w:ascii="Times New Roman" w:eastAsia="Times New Roman" w:hAnsi="Times New Roman" w:cs="Times New Roman"/>
-                <w:color w:val="000000"/>
-                <w:sz w:val="20"/>
-                <w:szCs w:val="20"/>
-              </w:rPr>
-              <w:t>]]</w:t>
+              <w:t>[[acel]]</w:t>
             </w:r>
           </w:p>
         </w:tc>
@@ -1160,25 +1056,7 @@
                 <w:sz w:val="20"/>
                 <w:szCs w:val="20"/>
               </w:rPr>
-              <w:t>[[</w:t>
-            </w:r>
-            <w:proofErr w:type="spellStart"/>
-            <w:r>
-              <w:rPr>
-                <w:rFonts w:ascii="Times New Roman" w:eastAsia="Times New Roman" w:hAnsi="Times New Roman" w:cs="Times New Roman"/>
-                <w:sz w:val="20"/>
-                <w:szCs w:val="20"/>
-              </w:rPr>
-              <w:t>acelcm</w:t>
-            </w:r>
-            <w:proofErr w:type="spellEnd"/>
-            <w:r>
-              <w:rPr>
-                <w:rFonts w:ascii="Times New Roman" w:eastAsia="Times New Roman" w:hAnsi="Times New Roman" w:cs="Times New Roman"/>
-                <w:sz w:val="20"/>
-                <w:szCs w:val="20"/>
-              </w:rPr>
-              <w:t>]]</w:t>
+              <w:t>[[acelcm]]</w:t>
             </w:r>
             <w:r>
               <w:rPr>
@@ -1291,25 +1169,7 @@
                 <w:sz w:val="20"/>
                 <w:szCs w:val="20"/>
               </w:rPr>
-              <w:t>[[</w:t>
-            </w:r>
-            <w:proofErr w:type="spellStart"/>
-            <w:r>
-              <w:rPr>
-                <w:rFonts w:ascii="Times New Roman" w:eastAsia="Times New Roman" w:hAnsi="Times New Roman" w:cs="Times New Roman"/>
-                <w:sz w:val="20"/>
-                <w:szCs w:val="20"/>
-              </w:rPr>
-              <w:t>vasbetoncm</w:t>
-            </w:r>
-            <w:proofErr w:type="spellEnd"/>
-            <w:r>
-              <w:rPr>
-                <w:rFonts w:ascii="Times New Roman" w:eastAsia="Times New Roman" w:hAnsi="Times New Roman" w:cs="Times New Roman"/>
-                <w:sz w:val="20"/>
-                <w:szCs w:val="20"/>
-              </w:rPr>
-              <w:t>]]</w:t>
+              <w:t>[[vasbetoncm]]</w:t>
             </w:r>
             <w:r>
               <w:rPr>
@@ -1422,25 +1282,7 @@
                 <w:sz w:val="20"/>
                 <w:szCs w:val="20"/>
               </w:rPr>
-              <w:t>[[</w:t>
-            </w:r>
-            <w:proofErr w:type="spellStart"/>
-            <w:r>
-              <w:rPr>
-                <w:rFonts w:ascii="Times New Roman" w:eastAsia="Times New Roman" w:hAnsi="Times New Roman" w:cs="Times New Roman"/>
-                <w:sz w:val="20"/>
-                <w:szCs w:val="20"/>
-              </w:rPr>
-              <w:t>monolitcm</w:t>
-            </w:r>
-            <w:proofErr w:type="spellEnd"/>
-            <w:r>
-              <w:rPr>
-                <w:rFonts w:ascii="Times New Roman" w:eastAsia="Times New Roman" w:hAnsi="Times New Roman" w:cs="Times New Roman"/>
-                <w:sz w:val="20"/>
-                <w:szCs w:val="20"/>
-              </w:rPr>
-              <w:t>]]</w:t>
+              <w:t>[[monolitcm]]</w:t>
             </w:r>
             <w:r>
               <w:rPr>
@@ -1527,23 +1369,7 @@
           <w:rFonts w:ascii="Times New Roman" w:eastAsia="Times New Roman" w:hAnsi="Times New Roman" w:cs="Times New Roman"/>
           <w:color w:val="000000"/>
         </w:rPr>
-        <w:t>[[</w:t>
-      </w:r>
-      <w:proofErr w:type="spellStart"/>
-      <w:r>
-        <w:rPr>
-          <w:rFonts w:ascii="Times New Roman" w:eastAsia="Times New Roman" w:hAnsi="Times New Roman" w:cs="Times New Roman"/>
-          <w:color w:val="000000"/>
-        </w:rPr>
-        <w:t>futes</w:t>
-      </w:r>
-      <w:proofErr w:type="spellEnd"/>
-      <w:r>
-        <w:rPr>
-          <w:rFonts w:ascii="Times New Roman" w:eastAsia="Times New Roman" w:hAnsi="Times New Roman" w:cs="Times New Roman"/>
-          <w:color w:val="000000"/>
-        </w:rPr>
-        <w:t>]]</w:t>
+        <w:t>[[futes]]</w:t>
       </w:r>
     </w:p>
     <w:p>
@@ -1785,27 +1611,7 @@
                 <w:sz w:val="20"/>
                 <w:szCs w:val="20"/>
               </w:rPr>
-              <w:t>[[</w:t>
-            </w:r>
-            <w:proofErr w:type="spellStart"/>
-            <w:r>
-              <w:rPr>
-                <w:rFonts w:ascii="Times New Roman" w:eastAsia="Times New Roman" w:hAnsi="Times New Roman" w:cs="Times New Roman"/>
-                <w:color w:val="000000"/>
-                <w:sz w:val="20"/>
-                <w:szCs w:val="20"/>
-              </w:rPr>
-              <w:t>garazs</w:t>
-            </w:r>
-            <w:proofErr w:type="spellEnd"/>
-            <w:r>
-              <w:rPr>
-                <w:rFonts w:ascii="Times New Roman" w:eastAsia="Times New Roman" w:hAnsi="Times New Roman" w:cs="Times New Roman"/>
-                <w:color w:val="000000"/>
-                <w:sz w:val="20"/>
-                <w:szCs w:val="20"/>
-              </w:rPr>
-              <w:t>]]</w:t>
+              <w:t>[[garazs]]</w:t>
             </w:r>
           </w:p>
         </w:tc>
@@ -1835,25 +1641,7 @@
                 <w:sz w:val="20"/>
                 <w:szCs w:val="20"/>
               </w:rPr>
-              <w:t>[[</w:t>
-            </w:r>
-            <w:proofErr w:type="spellStart"/>
-            <w:r>
-              <w:rPr>
-                <w:rFonts w:ascii="Times New Roman" w:eastAsia="Times New Roman" w:hAnsi="Times New Roman" w:cs="Times New Roman"/>
-                <w:sz w:val="20"/>
-                <w:szCs w:val="20"/>
-              </w:rPr>
-              <w:t>garazsnm</w:t>
-            </w:r>
-            <w:proofErr w:type="spellEnd"/>
-            <w:r>
-              <w:rPr>
-                <w:rFonts w:ascii="Times New Roman" w:eastAsia="Times New Roman" w:hAnsi="Times New Roman" w:cs="Times New Roman"/>
-                <w:sz w:val="20"/>
-                <w:szCs w:val="20"/>
-              </w:rPr>
-              <w:t>]]</w:t>
+              <w:t>[[garazsnm]]</w:t>
             </w:r>
             <w:r>
               <w:rPr>
@@ -1937,45 +1725,7 @@
                 <w:sz w:val="20"/>
                 <w:szCs w:val="20"/>
               </w:rPr>
-              <w:t>[[</w:t>
-            </w:r>
-            <w:proofErr w:type="spellStart"/>
-            <w:r>
-              <w:rPr>
-                <w:rFonts w:ascii="Times New Roman" w:eastAsia="Times New Roman" w:hAnsi="Times New Roman" w:cs="Times New Roman"/>
-                <w:color w:val="000000"/>
-                <w:sz w:val="20"/>
-                <w:szCs w:val="20"/>
-              </w:rPr>
-              <w:t>b</w:t>
-            </w:r>
-            <w:r>
-              <w:rPr>
-                <w:rFonts w:ascii="Times New Roman" w:eastAsia="Times New Roman" w:hAnsi="Times New Roman" w:cs="Times New Roman"/>
-                <w:color w:val="000000"/>
-                <w:sz w:val="20"/>
-                <w:szCs w:val="20"/>
-              </w:rPr>
-              <w:t>a</w:t>
-            </w:r>
-            <w:r>
-              <w:rPr>
-                <w:rFonts w:ascii="Times New Roman" w:eastAsia="Times New Roman" w:hAnsi="Times New Roman" w:cs="Times New Roman"/>
-                <w:color w:val="000000"/>
-                <w:sz w:val="20"/>
-                <w:szCs w:val="20"/>
-              </w:rPr>
-              <w:t>rmi</w:t>
-            </w:r>
-            <w:proofErr w:type="spellEnd"/>
-            <w:r>
-              <w:rPr>
-                <w:rFonts w:ascii="Times New Roman" w:eastAsia="Times New Roman" w:hAnsi="Times New Roman" w:cs="Times New Roman"/>
-                <w:color w:val="000000"/>
-                <w:sz w:val="20"/>
-                <w:szCs w:val="20"/>
-              </w:rPr>
-              <w:t>]]</w:t>
+              <w:t>[[barmi]]</w:t>
             </w:r>
           </w:p>
         </w:tc>
@@ -2005,25 +1755,7 @@
                 <w:sz w:val="20"/>
                 <w:szCs w:val="20"/>
               </w:rPr>
-              <w:t>[[</w:t>
-            </w:r>
-            <w:proofErr w:type="spellStart"/>
-            <w:r>
-              <w:rPr>
-                <w:rFonts w:ascii="Times New Roman" w:eastAsia="Times New Roman" w:hAnsi="Times New Roman" w:cs="Times New Roman"/>
-                <w:sz w:val="20"/>
-                <w:szCs w:val="20"/>
-              </w:rPr>
-              <w:t>bárminm</w:t>
-            </w:r>
-            <w:proofErr w:type="spellEnd"/>
-            <w:r>
-              <w:rPr>
-                <w:rFonts w:ascii="Times New Roman" w:eastAsia="Times New Roman" w:hAnsi="Times New Roman" w:cs="Times New Roman"/>
-                <w:sz w:val="20"/>
-                <w:szCs w:val="20"/>
-              </w:rPr>
-              <w:t>]]</w:t>
+              <w:t>[[bárminm]]</w:t>
             </w:r>
             <w:r>
               <w:rPr>
@@ -2107,45 +1839,7 @@
                 <w:sz w:val="20"/>
                 <w:szCs w:val="20"/>
               </w:rPr>
-              <w:t>[[</w:t>
-            </w:r>
-            <w:proofErr w:type="spellStart"/>
-            <w:r>
-              <w:rPr>
-                <w:rFonts w:ascii="Times New Roman" w:eastAsia="Times New Roman" w:hAnsi="Times New Roman" w:cs="Times New Roman"/>
-                <w:color w:val="000000"/>
-                <w:sz w:val="20"/>
-                <w:szCs w:val="20"/>
-              </w:rPr>
-              <w:t>egy</w:t>
-            </w:r>
-            <w:r>
-              <w:rPr>
-                <w:rFonts w:ascii="Times New Roman" w:eastAsia="Times New Roman" w:hAnsi="Times New Roman" w:cs="Times New Roman"/>
-                <w:color w:val="000000"/>
-                <w:sz w:val="20"/>
-                <w:szCs w:val="20"/>
-              </w:rPr>
-              <w:t>e</w:t>
-            </w:r>
-            <w:r>
-              <w:rPr>
-                <w:rFonts w:ascii="Times New Roman" w:eastAsia="Times New Roman" w:hAnsi="Times New Roman" w:cs="Times New Roman"/>
-                <w:color w:val="000000"/>
-                <w:sz w:val="20"/>
-                <w:szCs w:val="20"/>
-              </w:rPr>
-              <w:t>b</w:t>
-            </w:r>
-            <w:proofErr w:type="spellEnd"/>
-            <w:r>
-              <w:rPr>
-                <w:rFonts w:ascii="Times New Roman" w:eastAsia="Times New Roman" w:hAnsi="Times New Roman" w:cs="Times New Roman"/>
-                <w:color w:val="000000"/>
-                <w:sz w:val="20"/>
-                <w:szCs w:val="20"/>
-              </w:rPr>
-              <w:t>]]</w:t>
+              <w:t>[[egyeb]]</w:t>
             </w:r>
           </w:p>
         </w:tc>
@@ -2175,41 +1869,7 @@
                 <w:sz w:val="20"/>
                 <w:szCs w:val="20"/>
               </w:rPr>
-              <w:t>[[</w:t>
-            </w:r>
-            <w:proofErr w:type="spellStart"/>
-            <w:r>
-              <w:rPr>
-                <w:rFonts w:ascii="Times New Roman" w:eastAsia="Times New Roman" w:hAnsi="Times New Roman" w:cs="Times New Roman"/>
-                <w:sz w:val="20"/>
-                <w:szCs w:val="20"/>
-              </w:rPr>
-              <w:t>egy</w:t>
-            </w:r>
-            <w:r>
-              <w:rPr>
-                <w:rFonts w:ascii="Times New Roman" w:eastAsia="Times New Roman" w:hAnsi="Times New Roman" w:cs="Times New Roman"/>
-                <w:sz w:val="20"/>
-                <w:szCs w:val="20"/>
-              </w:rPr>
-              <w:t>e</w:t>
-            </w:r>
-            <w:r>
-              <w:rPr>
-                <w:rFonts w:ascii="Times New Roman" w:eastAsia="Times New Roman" w:hAnsi="Times New Roman" w:cs="Times New Roman"/>
-                <w:sz w:val="20"/>
-                <w:szCs w:val="20"/>
-              </w:rPr>
-              <w:t>bnm</w:t>
-            </w:r>
-            <w:proofErr w:type="spellEnd"/>
-            <w:r>
-              <w:rPr>
-                <w:rFonts w:ascii="Times New Roman" w:eastAsia="Times New Roman" w:hAnsi="Times New Roman" w:cs="Times New Roman"/>
-                <w:sz w:val="20"/>
-                <w:szCs w:val="20"/>
-              </w:rPr>
-              <w:t>]]</w:t>
+              <w:t>[[egyebnm]]</w:t>
             </w:r>
             <w:r>
               <w:rPr>
@@ -2572,25 +2232,7 @@
                 <w:sz w:val="20"/>
                 <w:szCs w:val="20"/>
               </w:rPr>
-              <w:t>[[</w:t>
-            </w:r>
-            <w:proofErr w:type="spellStart"/>
-            <w:r>
-              <w:rPr>
-                <w:rFonts w:ascii="Times New Roman" w:hAnsi="Times New Roman" w:cs="Times New Roman"/>
-                <w:sz w:val="20"/>
-                <w:szCs w:val="20"/>
-              </w:rPr>
-              <w:t>padlasfeljaro_szigetelese_igen</w:t>
-            </w:r>
-            <w:proofErr w:type="spellEnd"/>
-            <w:r>
-              <w:rPr>
-                <w:rFonts w:ascii="Times New Roman" w:hAnsi="Times New Roman" w:cs="Times New Roman"/>
-                <w:sz w:val="20"/>
-                <w:szCs w:val="20"/>
-              </w:rPr>
-              <w:t xml:space="preserve">]] </w:t>
+              <w:t>[[padlasfeljaro_szigetelese_igen]] </w:t>
             </w:r>
             <w:r>
               <w:rPr>
@@ -2618,25 +2260,7 @@
                 <w:sz w:val="20"/>
                 <w:szCs w:val="20"/>
               </w:rPr>
-              <w:t>[[</w:t>
-            </w:r>
-            <w:proofErr w:type="spellStart"/>
-            <w:r>
-              <w:rPr>
-                <w:rFonts w:ascii="Times New Roman" w:hAnsi="Times New Roman" w:cs="Times New Roman"/>
-                <w:sz w:val="20"/>
-                <w:szCs w:val="20"/>
-              </w:rPr>
-              <w:t>padlasfeljaro_szigetelese_nem</w:t>
-            </w:r>
-            <w:proofErr w:type="spellEnd"/>
-            <w:r>
-              <w:rPr>
-                <w:rFonts w:ascii="Times New Roman" w:hAnsi="Times New Roman" w:cs="Times New Roman"/>
-                <w:sz w:val="20"/>
-                <w:szCs w:val="20"/>
-              </w:rPr>
-              <w:t xml:space="preserve">]] </w:t>
+              <w:t>[[padlasfeljaro_szigetelese_nem]] </w:t>
             </w:r>
             <w:r>
               <w:rPr>
@@ -2670,25 +2294,7 @@
                 <w:sz w:val="20"/>
                 <w:szCs w:val="20"/>
               </w:rPr>
-              <w:t>[[</w:t>
-            </w:r>
-            <w:proofErr w:type="spellStart"/>
-            <w:r>
-              <w:rPr>
-                <w:rFonts w:ascii="Times New Roman" w:hAnsi="Times New Roman" w:cs="Times New Roman"/>
-                <w:sz w:val="20"/>
-                <w:szCs w:val="20"/>
-              </w:rPr>
-              <w:t>pf_kivul_fodemen</w:t>
-            </w:r>
-            <w:proofErr w:type="spellEnd"/>
-            <w:r>
-              <w:rPr>
-                <w:rFonts w:ascii="Times New Roman" w:hAnsi="Times New Roman" w:cs="Times New Roman"/>
-                <w:sz w:val="20"/>
-                <w:szCs w:val="20"/>
-              </w:rPr>
-              <w:t xml:space="preserve">]] </w:t>
+              <w:t>[[pf_kivul_fodemen]] </w:t>
             </w:r>
             <w:r>
               <w:rPr>
@@ -2716,25 +2322,7 @@
                 <w:sz w:val="20"/>
                 <w:szCs w:val="20"/>
               </w:rPr>
-              <w:t>[[</w:t>
-            </w:r>
-            <w:proofErr w:type="spellStart"/>
-            <w:r>
-              <w:rPr>
-                <w:rFonts w:ascii="Times New Roman" w:hAnsi="Times New Roman" w:cs="Times New Roman"/>
-                <w:sz w:val="20"/>
-                <w:szCs w:val="20"/>
-              </w:rPr>
-              <w:t>pf_kivul_oromfal</w:t>
-            </w:r>
-            <w:proofErr w:type="spellEnd"/>
-            <w:r>
-              <w:rPr>
-                <w:rFonts w:ascii="Times New Roman" w:hAnsi="Times New Roman" w:cs="Times New Roman"/>
-                <w:sz w:val="20"/>
-                <w:szCs w:val="20"/>
-              </w:rPr>
-              <w:t>]]</w:t>
+              <w:t>[[pf_kivul_oromfal]]</w:t>
             </w:r>
             <w:r>
               <w:rPr>
@@ -2770,25 +2358,7 @@
                 <w:sz w:val="20"/>
                 <w:szCs w:val="20"/>
               </w:rPr>
-              <w:t>[[</w:t>
-            </w:r>
-            <w:proofErr w:type="spellStart"/>
-            <w:r>
-              <w:rPr>
-                <w:rFonts w:ascii="Times New Roman" w:hAnsi="Times New Roman" w:cs="Times New Roman"/>
-                <w:sz w:val="20"/>
-                <w:szCs w:val="20"/>
-              </w:rPr>
-              <w:t>pf_kivul_bonthato</w:t>
-            </w:r>
-            <w:proofErr w:type="spellEnd"/>
-            <w:r>
-              <w:rPr>
-                <w:rFonts w:ascii="Times New Roman" w:hAnsi="Times New Roman" w:cs="Times New Roman"/>
-                <w:sz w:val="20"/>
-                <w:szCs w:val="20"/>
-              </w:rPr>
-              <w:t xml:space="preserve">]] </w:t>
+              <w:t>[[pf_kivul_bonthato]] </w:t>
             </w:r>
             <w:r>
               <w:rPr>
@@ -2811,25 +2381,7 @@
                 <w:sz w:val="20"/>
                 <w:szCs w:val="20"/>
               </w:rPr>
-              <w:t>[[</w:t>
-            </w:r>
-            <w:proofErr w:type="spellStart"/>
-            <w:r>
-              <w:rPr>
-                <w:rFonts w:ascii="Times New Roman" w:hAnsi="Times New Roman" w:cs="Times New Roman"/>
-                <w:sz w:val="20"/>
-                <w:szCs w:val="20"/>
-              </w:rPr>
-              <w:t>pf_kivul_egyeb</w:t>
-            </w:r>
-            <w:proofErr w:type="spellEnd"/>
-            <w:r>
-              <w:rPr>
-                <w:rFonts w:ascii="Times New Roman" w:hAnsi="Times New Roman" w:cs="Times New Roman"/>
-                <w:sz w:val="20"/>
-                <w:szCs w:val="20"/>
-              </w:rPr>
-              <w:t>]]</w:t>
+              <w:t>[[pf_kivul_egyeb]]</w:t>
             </w:r>
             <w:r>
               <w:rPr>
@@ -2974,17 +2526,29 @@
       <w:pPr>
         <w:spacing w:before="120" w:after="240" w:line="336" w:lineRule="auto"/>
         <w:jc w:val="both"/>
-        <w:rPr>
-          <w:rFonts w:ascii="Times New Roman" w:hAnsi="Times New Roman" w:cs="Times New Roman"/>
-          <w:sz w:val="20"/>
-          <w:szCs w:val="20"/>
-        </w:rPr>
       </w:pPr>
       <w:r>
         <w:t xml:space="preserve">       </w:t>
       </w:r>
       <w:r>
         <w:t>[[%alaprajz]]</w:t>
+      </w:r>
+    </w:p>
+    <w:p>
+      <w:pPr>
+        <w:spacing w:before="120" w:after="240" w:line="336" w:lineRule="auto"/>
+        <w:jc w:val="both"/>
+        <w:rPr>
+          <w:rFonts w:ascii="Times New Roman" w:hAnsi="Times New Roman" w:cs="Times New Roman"/>
+          <w:sz w:val="20"/>
+          <w:szCs w:val="20"/>
+        </w:rPr>
+      </w:pPr>
+      <w:r>
+        <w:t xml:space="preserve">       </w:t>
+      </w:r>
+      <w:r>
+        <w:t>[[%alaprajzplusz]]</w:t>
       </w:r>
     </w:p>
     <w:p>
@@ -3246,25 +2810,7 @@
                 <w:sz w:val="20"/>
                 <w:szCs w:val="20"/>
               </w:rPr>
-              <w:t>[[</w:t>
-            </w:r>
-            <w:proofErr w:type="spellStart"/>
-            <w:r>
-              <w:rPr>
-                <w:rFonts w:ascii="Times New Roman" w:eastAsia="Times New Roman" w:hAnsi="Times New Roman" w:cs="Times New Roman"/>
-                <w:sz w:val="20"/>
-                <w:szCs w:val="20"/>
-              </w:rPr>
-              <w:t>brszig</w:t>
-            </w:r>
-            <w:proofErr w:type="spellEnd"/>
-            <w:r>
-              <w:rPr>
-                <w:rFonts w:ascii="Times New Roman" w:eastAsia="Times New Roman" w:hAnsi="Times New Roman" w:cs="Times New Roman"/>
-                <w:sz w:val="20"/>
-                <w:szCs w:val="20"/>
-              </w:rPr>
-              <w:t>]]</w:t>
+              <w:t>[[brszig]]</w:t>
             </w:r>
           </w:p>
         </w:tc>
@@ -3393,25 +2939,7 @@
                 <w:sz w:val="20"/>
                 <w:szCs w:val="20"/>
               </w:rPr>
-              <w:t>[[</w:t>
-            </w:r>
-            <w:proofErr w:type="spellStart"/>
-            <w:r>
-              <w:rPr>
-                <w:rFonts w:ascii="Times New Roman" w:eastAsia="Times New Roman" w:hAnsi="Times New Roman" w:cs="Times New Roman"/>
-                <w:sz w:val="20"/>
-                <w:szCs w:val="20"/>
-              </w:rPr>
-              <w:t>kemeny</w:t>
-            </w:r>
-            <w:proofErr w:type="spellEnd"/>
-            <w:r>
-              <w:rPr>
-                <w:rFonts w:ascii="Times New Roman" w:eastAsia="Times New Roman" w:hAnsi="Times New Roman" w:cs="Times New Roman"/>
-                <w:sz w:val="20"/>
-                <w:szCs w:val="20"/>
-              </w:rPr>
-              <w:t>]]</w:t>
+              <w:t>[[kemeny]]</w:t>
             </w:r>
           </w:p>
         </w:tc>
@@ -3538,25 +3066,7 @@
                 <w:sz w:val="20"/>
                 <w:szCs w:val="20"/>
               </w:rPr>
-              <w:t>[[</w:t>
-            </w:r>
-            <w:proofErr w:type="spellStart"/>
-            <w:r>
-              <w:rPr>
-                <w:rFonts w:ascii="Times New Roman" w:eastAsia="Times New Roman" w:hAnsi="Times New Roman" w:cs="Times New Roman"/>
-                <w:sz w:val="20"/>
-                <w:szCs w:val="20"/>
-              </w:rPr>
-              <w:t>padlasfeljaro</w:t>
-            </w:r>
-            <w:proofErr w:type="spellEnd"/>
-            <w:r>
-              <w:rPr>
-                <w:rFonts w:ascii="Times New Roman" w:eastAsia="Times New Roman" w:hAnsi="Times New Roman" w:cs="Times New Roman"/>
-                <w:sz w:val="20"/>
-                <w:szCs w:val="20"/>
-              </w:rPr>
-              <w:t>]]</w:t>
+              <w:t>[[padlasfeljaro]]</w:t>
             </w:r>
           </w:p>
         </w:tc>
@@ -3663,25 +3173,7 @@
                 <w:sz w:val="20"/>
                 <w:szCs w:val="20"/>
               </w:rPr>
-              <w:t>[[</w:t>
-            </w:r>
-            <w:proofErr w:type="spellStart"/>
-            <w:r>
-              <w:rPr>
-                <w:rFonts w:ascii="Times New Roman" w:eastAsia="Times New Roman" w:hAnsi="Times New Roman" w:cs="Times New Roman"/>
-                <w:sz w:val="20"/>
-                <w:szCs w:val="20"/>
-              </w:rPr>
-              <w:t>egyeblevonando</w:t>
-            </w:r>
-            <w:proofErr w:type="spellEnd"/>
-            <w:r>
-              <w:rPr>
-                <w:rFonts w:ascii="Times New Roman" w:eastAsia="Times New Roman" w:hAnsi="Times New Roman" w:cs="Times New Roman"/>
-                <w:sz w:val="20"/>
-                <w:szCs w:val="20"/>
-              </w:rPr>
-              <w:t>]]</w:t>
+              <w:t>[[egyeblevonando]]</w:t>
             </w:r>
           </w:p>
         </w:tc>
@@ -3788,25 +3280,7 @@
                 <w:sz w:val="20"/>
                 <w:szCs w:val="20"/>
               </w:rPr>
-              <w:t>[[</w:t>
-            </w:r>
-            <w:proofErr w:type="spellStart"/>
-            <w:r>
-              <w:rPr>
-                <w:rFonts w:ascii="Times New Roman" w:eastAsia="Times New Roman" w:hAnsi="Times New Roman" w:cs="Times New Roman"/>
-                <w:sz w:val="20"/>
-                <w:szCs w:val="20"/>
-              </w:rPr>
-              <w:t>nettoalapterulet</w:t>
-            </w:r>
-            <w:proofErr w:type="spellEnd"/>
-            <w:r>
-              <w:rPr>
-                <w:rFonts w:ascii="Times New Roman" w:eastAsia="Times New Roman" w:hAnsi="Times New Roman" w:cs="Times New Roman"/>
-                <w:sz w:val="20"/>
-                <w:szCs w:val="20"/>
-              </w:rPr>
-              <w:t>]]</w:t>
+              <w:t>[[nettoalapterulet]]</w:t>
             </w:r>
           </w:p>
         </w:tc>
@@ -3864,27 +3338,7 @@
           <w:szCs w:val="20"/>
           <w:highlight w:val="white"/>
         </w:rPr>
-        <w:t>Rád, [[</w:t>
-      </w:r>
-      <w:proofErr w:type="spellStart"/>
-      <w:r>
-        <w:rPr>
-          <w:rFonts w:ascii="Times New Roman" w:eastAsia="Times New Roman" w:hAnsi="Times New Roman" w:cs="Times New Roman"/>
-          <w:sz w:val="20"/>
-          <w:szCs w:val="20"/>
-          <w:highlight w:val="white"/>
-        </w:rPr>
-        <w:t>datum</w:t>
-      </w:r>
-      <w:proofErr w:type="spellEnd"/>
-      <w:r>
-        <w:rPr>
-          <w:rFonts w:ascii="Times New Roman" w:eastAsia="Times New Roman" w:hAnsi="Times New Roman" w:cs="Times New Roman"/>
-          <w:sz w:val="20"/>
-          <w:szCs w:val="20"/>
-          <w:highlight w:val="white"/>
-        </w:rPr>
-        <w:t>]]</w:t>
+        <w:t>Rád, [[datum]]</w:t>
       </w:r>
     </w:p>
     <w:p>
@@ -4059,25 +3513,7 @@
                 <w:sz w:val="20"/>
                 <w:szCs w:val="20"/>
               </w:rPr>
-              <w:t>[[</w:t>
-            </w:r>
-            <w:proofErr w:type="spellStart"/>
-            <w:r>
-              <w:rPr>
-                <w:rFonts w:ascii="Times New Roman" w:eastAsia="Times New Roman" w:hAnsi="Times New Roman" w:cs="Times New Roman"/>
-                <w:sz w:val="20"/>
-                <w:szCs w:val="20"/>
-              </w:rPr>
-              <w:t>nev</w:t>
-            </w:r>
-            <w:proofErr w:type="spellEnd"/>
-            <w:r>
-              <w:rPr>
-                <w:rFonts w:ascii="Times New Roman" w:eastAsia="Times New Roman" w:hAnsi="Times New Roman" w:cs="Times New Roman"/>
-                <w:sz w:val="20"/>
-                <w:szCs w:val="20"/>
-              </w:rPr>
-              <w:t>]]</w:t>
+              <w:t>[[nev]]</w:t>
             </w:r>
           </w:p>
         </w:tc>

</xml_diff>